<commit_message>
adding T10, T12 fixes
</commit_message>
<xml_diff>
--- a/TASK10/TASK10-OP-Tim.docx
+++ b/TASK10/TASK10-OP-Tim.docx
@@ -8,18 +8,18 @@
           <w:noProof/>
         </w:rPr>
         <w:drawing>
-          <wp:anchor distT="0" distB="0" distL="114300" distR="114300" simplePos="0" relativeHeight="251683840" behindDoc="0" locked="0" layoutInCell="1" allowOverlap="1" wp14:anchorId="386D1B93" wp14:editId="00B7CEC4">
+          <wp:anchor distT="0" distB="0" distL="114300" distR="114300" simplePos="0" relativeHeight="251658240" behindDoc="0" locked="0" layoutInCell="1" allowOverlap="1" wp14:anchorId="28245BAE" wp14:editId="7248EC1C">
             <wp:simplePos x="0" y="0"/>
-            <wp:positionH relativeFrom="page">
-              <wp:align>left</wp:align>
+            <wp:positionH relativeFrom="column">
+              <wp:posOffset>-555328</wp:posOffset>
             </wp:positionH>
             <wp:positionV relativeFrom="paragraph">
-              <wp:posOffset>-746760</wp:posOffset>
+              <wp:posOffset>-825043</wp:posOffset>
             </wp:positionV>
-            <wp:extent cx="7398809" cy="1828800"/>
-            <wp:effectExtent l="76200" t="76200" r="126365" b="133350"/>
+            <wp:extent cx="5588763" cy="1936796"/>
+            <wp:effectExtent l="76200" t="76200" r="126365" b="139700"/>
             <wp:wrapNone/>
-            <wp:docPr id="12" name="Picture 12"/>
+            <wp:docPr id="1" name="Picture 1"/>
             <wp:cNvGraphicFramePr>
               <a:graphicFrameLocks xmlns:a="http://schemas.openxmlformats.org/drawingml/2006/main" noChangeAspect="1"/>
             </wp:cNvGraphicFramePr>
@@ -45,7 +45,7 @@
                   <pic:spPr>
                     <a:xfrm>
                       <a:off x="0" y="0"/>
-                      <a:ext cx="7398809" cy="1828800"/>
+                      <a:ext cx="5599801" cy="1940621"/>
                     </a:xfrm>
                     <a:prstGeom prst="rect">
                       <a:avLst/>
@@ -80,24 +80,25 @@
     </w:p>
     <w:p/>
     <w:p/>
+    <w:p/>
     <w:p>
       <w:r>
         <w:rPr>
           <w:noProof/>
         </w:rPr>
         <w:drawing>
-          <wp:anchor distT="0" distB="0" distL="114300" distR="114300" simplePos="0" relativeHeight="251689984" behindDoc="0" locked="0" layoutInCell="1" allowOverlap="1" wp14:anchorId="6F38095B" wp14:editId="4F4EE784">
+          <wp:anchor distT="0" distB="0" distL="114300" distR="114300" simplePos="0" relativeHeight="251659264" behindDoc="0" locked="0" layoutInCell="1" allowOverlap="1" wp14:anchorId="02CADF7E" wp14:editId="710CFC7B">
             <wp:simplePos x="0" y="0"/>
-            <wp:positionH relativeFrom="page">
-              <wp:align>left</wp:align>
+            <wp:positionH relativeFrom="column">
+              <wp:posOffset>-535593</wp:posOffset>
             </wp:positionH>
             <wp:positionV relativeFrom="paragraph">
-              <wp:posOffset>4149725</wp:posOffset>
+              <wp:posOffset>91636</wp:posOffset>
             </wp:positionV>
-            <wp:extent cx="7363558" cy="510540"/>
-            <wp:effectExtent l="76200" t="76200" r="142240" b="137160"/>
+            <wp:extent cx="6837660" cy="3094598"/>
+            <wp:effectExtent l="76200" t="76200" r="135255" b="125095"/>
             <wp:wrapNone/>
-            <wp:docPr id="23" name="Picture 23"/>
+            <wp:docPr id="2" name="Picture 2"/>
             <wp:cNvGraphicFramePr>
               <a:graphicFrameLocks xmlns:a="http://schemas.openxmlformats.org/drawingml/2006/main" noChangeAspect="1"/>
             </wp:cNvGraphicFramePr>
@@ -105,28 +106,798 @@
               <a:graphicData uri="http://schemas.openxmlformats.org/drawingml/2006/picture">
                 <pic:pic xmlns:pic="http://schemas.openxmlformats.org/drawingml/2006/picture">
                   <pic:nvPicPr>
-                    <pic:cNvPr id="0" name="Picture 4"/>
-                    <pic:cNvPicPr>
-                      <a:picLocks noChangeAspect="1" noChangeArrowheads="1"/>
-                    </pic:cNvPicPr>
+                    <pic:cNvPr id="1" name=""/>
+                    <pic:cNvPicPr/>
                   </pic:nvPicPr>
                   <pic:blipFill>
-                    <a:blip r:embed="rId8" cstate="print">
+                    <a:blip r:embed="rId8">
                       <a:extLst>
                         <a:ext uri="{28A0092B-C50C-407E-A947-70E740481C1C}">
                           <a14:useLocalDpi xmlns:a14="http://schemas.microsoft.com/office/drawing/2010/main" val="0"/>
                         </a:ext>
                       </a:extLst>
                     </a:blip>
-                    <a:srcRect/>
                     <a:stretch>
                       <a:fillRect/>
                     </a:stretch>
                   </pic:blipFill>
-                  <pic:spPr bwMode="auto">
+                  <pic:spPr>
                     <a:xfrm>
                       <a:off x="0" y="0"/>
-                      <a:ext cx="7365375" cy="510666"/>
+                      <a:ext cx="6847506" cy="3099054"/>
+                    </a:xfrm>
+                    <a:prstGeom prst="rect">
+                      <a:avLst/>
+                    </a:prstGeom>
+                    <a:ln w="38100" cap="sq">
+                      <a:solidFill>
+                        <a:srgbClr val="000000"/>
+                      </a:solidFill>
+                      <a:prstDash val="solid"/>
+                      <a:miter lim="800000"/>
+                    </a:ln>
+                    <a:effectLst>
+                      <a:outerShdw blurRad="50800" dist="38100" dir="2700000" algn="tl" rotWithShape="0">
+                        <a:srgbClr val="000000">
+                          <a:alpha val="43000"/>
+                        </a:srgbClr>
+                      </a:outerShdw>
+                    </a:effectLst>
+                  </pic:spPr>
+                </pic:pic>
+              </a:graphicData>
+            </a:graphic>
+            <wp14:sizeRelH relativeFrom="margin">
+              <wp14:pctWidth>0</wp14:pctWidth>
+            </wp14:sizeRelH>
+            <wp14:sizeRelV relativeFrom="margin">
+              <wp14:pctHeight>0</wp14:pctHeight>
+            </wp14:sizeRelV>
+          </wp:anchor>
+        </w:drawing>
+      </w:r>
+    </w:p>
+    <w:p/>
+    <w:p/>
+    <w:p/>
+    <w:p/>
+    <w:p/>
+    <w:p/>
+    <w:p/>
+    <w:p/>
+    <w:p/>
+    <w:p/>
+    <w:p>
+      <w:r>
+        <w:rPr>
+          <w:noProof/>
+        </w:rPr>
+        <w:drawing>
+          <wp:anchor distT="0" distB="0" distL="114300" distR="114300" simplePos="0" relativeHeight="251660288" behindDoc="0" locked="0" layoutInCell="1" allowOverlap="1" wp14:anchorId="4CC2594A" wp14:editId="38761B97">
+            <wp:simplePos x="0" y="0"/>
+            <wp:positionH relativeFrom="column">
+              <wp:posOffset>-496122</wp:posOffset>
+            </wp:positionH>
+            <wp:positionV relativeFrom="paragraph">
+              <wp:posOffset>199395</wp:posOffset>
+            </wp:positionV>
+            <wp:extent cx="6723182" cy="1357895"/>
+            <wp:effectExtent l="76200" t="76200" r="135255" b="128270"/>
+            <wp:wrapNone/>
+            <wp:docPr id="3" name="Picture 3"/>
+            <wp:cNvGraphicFramePr>
+              <a:graphicFrameLocks xmlns:a="http://schemas.openxmlformats.org/drawingml/2006/main" noChangeAspect="1"/>
+            </wp:cNvGraphicFramePr>
+            <a:graphic xmlns:a="http://schemas.openxmlformats.org/drawingml/2006/main">
+              <a:graphicData uri="http://schemas.openxmlformats.org/drawingml/2006/picture">
+                <pic:pic xmlns:pic="http://schemas.openxmlformats.org/drawingml/2006/picture">
+                  <pic:nvPicPr>
+                    <pic:cNvPr id="1" name=""/>
+                    <pic:cNvPicPr/>
+                  </pic:nvPicPr>
+                  <pic:blipFill>
+                    <a:blip r:embed="rId9">
+                      <a:extLst>
+                        <a:ext uri="{28A0092B-C50C-407E-A947-70E740481C1C}">
+                          <a14:useLocalDpi xmlns:a14="http://schemas.microsoft.com/office/drawing/2010/main" val="0"/>
+                        </a:ext>
+                      </a:extLst>
+                    </a:blip>
+                    <a:stretch>
+                      <a:fillRect/>
+                    </a:stretch>
+                  </pic:blipFill>
+                  <pic:spPr>
+                    <a:xfrm>
+                      <a:off x="0" y="0"/>
+                      <a:ext cx="6748745" cy="1363058"/>
+                    </a:xfrm>
+                    <a:prstGeom prst="rect">
+                      <a:avLst/>
+                    </a:prstGeom>
+                    <a:ln w="38100" cap="sq">
+                      <a:solidFill>
+                        <a:srgbClr val="000000"/>
+                      </a:solidFill>
+                      <a:prstDash val="solid"/>
+                      <a:miter lim="800000"/>
+                    </a:ln>
+                    <a:effectLst>
+                      <a:outerShdw blurRad="50800" dist="38100" dir="2700000" algn="tl" rotWithShape="0">
+                        <a:srgbClr val="000000">
+                          <a:alpha val="43000"/>
+                        </a:srgbClr>
+                      </a:outerShdw>
+                    </a:effectLst>
+                  </pic:spPr>
+                </pic:pic>
+              </a:graphicData>
+            </a:graphic>
+            <wp14:sizeRelH relativeFrom="margin">
+              <wp14:pctWidth>0</wp14:pctWidth>
+            </wp14:sizeRelH>
+            <wp14:sizeRelV relativeFrom="margin">
+              <wp14:pctHeight>0</wp14:pctHeight>
+            </wp14:sizeRelV>
+          </wp:anchor>
+        </w:drawing>
+      </w:r>
+    </w:p>
+    <w:p/>
+    <w:p/>
+    <w:p/>
+    <w:p/>
+    <w:p/>
+    <w:p>
+      <w:r>
+        <w:rPr>
+          <w:noProof/>
+        </w:rPr>
+        <w:drawing>
+          <wp:anchor distT="0" distB="0" distL="114300" distR="114300" simplePos="0" relativeHeight="251662336" behindDoc="0" locked="0" layoutInCell="1" allowOverlap="1" wp14:anchorId="10A65728" wp14:editId="3201D3BF">
+            <wp:simplePos x="0" y="0"/>
+            <wp:positionH relativeFrom="column">
+              <wp:posOffset>-509280</wp:posOffset>
+            </wp:positionH>
+            <wp:positionV relativeFrom="paragraph">
+              <wp:posOffset>84084</wp:posOffset>
+            </wp:positionV>
+            <wp:extent cx="6833841" cy="1114493"/>
+            <wp:effectExtent l="76200" t="76200" r="139065" b="123825"/>
+            <wp:wrapNone/>
+            <wp:docPr id="5" name="Picture 5"/>
+            <wp:cNvGraphicFramePr>
+              <a:graphicFrameLocks xmlns:a="http://schemas.openxmlformats.org/drawingml/2006/main" noChangeAspect="1"/>
+            </wp:cNvGraphicFramePr>
+            <a:graphic xmlns:a="http://schemas.openxmlformats.org/drawingml/2006/main">
+              <a:graphicData uri="http://schemas.openxmlformats.org/drawingml/2006/picture">
+                <pic:pic xmlns:pic="http://schemas.openxmlformats.org/drawingml/2006/picture">
+                  <pic:nvPicPr>
+                    <pic:cNvPr id="1" name=""/>
+                    <pic:cNvPicPr/>
+                  </pic:nvPicPr>
+                  <pic:blipFill>
+                    <a:blip r:embed="rId10">
+                      <a:extLst>
+                        <a:ext uri="{28A0092B-C50C-407E-A947-70E740481C1C}">
+                          <a14:useLocalDpi xmlns:a14="http://schemas.microsoft.com/office/drawing/2010/main" val="0"/>
+                        </a:ext>
+                      </a:extLst>
+                    </a:blip>
+                    <a:stretch>
+                      <a:fillRect/>
+                    </a:stretch>
+                  </pic:blipFill>
+                  <pic:spPr>
+                    <a:xfrm>
+                      <a:off x="0" y="0"/>
+                      <a:ext cx="6842729" cy="1115942"/>
+                    </a:xfrm>
+                    <a:prstGeom prst="rect">
+                      <a:avLst/>
+                    </a:prstGeom>
+                    <a:ln w="38100" cap="sq">
+                      <a:solidFill>
+                        <a:srgbClr val="000000"/>
+                      </a:solidFill>
+                      <a:prstDash val="solid"/>
+                      <a:miter lim="800000"/>
+                    </a:ln>
+                    <a:effectLst>
+                      <a:outerShdw blurRad="50800" dist="38100" dir="2700000" algn="tl" rotWithShape="0">
+                        <a:srgbClr val="000000">
+                          <a:alpha val="43000"/>
+                        </a:srgbClr>
+                      </a:outerShdw>
+                    </a:effectLst>
+                  </pic:spPr>
+                </pic:pic>
+              </a:graphicData>
+            </a:graphic>
+            <wp14:sizeRelH relativeFrom="margin">
+              <wp14:pctWidth>0</wp14:pctWidth>
+            </wp14:sizeRelH>
+            <wp14:sizeRelV relativeFrom="margin">
+              <wp14:pctHeight>0</wp14:pctHeight>
+            </wp14:sizeRelV>
+          </wp:anchor>
+        </w:drawing>
+      </w:r>
+    </w:p>
+    <w:p/>
+    <w:p/>
+    <w:p/>
+    <w:p>
+      <w:r>
+        <w:rPr>
+          <w:noProof/>
+        </w:rPr>
+        <w:drawing>
+          <wp:anchor distT="0" distB="0" distL="114300" distR="114300" simplePos="0" relativeHeight="251663360" behindDoc="0" locked="0" layoutInCell="1" allowOverlap="1" wp14:anchorId="1E260DFE" wp14:editId="65D2ED8C">
+            <wp:simplePos x="0" y="0"/>
+            <wp:positionH relativeFrom="column">
+              <wp:posOffset>-463231</wp:posOffset>
+            </wp:positionH>
+            <wp:positionV relativeFrom="paragraph">
+              <wp:posOffset>191618</wp:posOffset>
+            </wp:positionV>
+            <wp:extent cx="3607713" cy="1711329"/>
+            <wp:effectExtent l="76200" t="76200" r="126365" b="136525"/>
+            <wp:wrapNone/>
+            <wp:docPr id="6" name="Picture 6"/>
+            <wp:cNvGraphicFramePr>
+              <a:graphicFrameLocks xmlns:a="http://schemas.openxmlformats.org/drawingml/2006/main" noChangeAspect="1"/>
+            </wp:cNvGraphicFramePr>
+            <a:graphic xmlns:a="http://schemas.openxmlformats.org/drawingml/2006/main">
+              <a:graphicData uri="http://schemas.openxmlformats.org/drawingml/2006/picture">
+                <pic:pic xmlns:pic="http://schemas.openxmlformats.org/drawingml/2006/picture">
+                  <pic:nvPicPr>
+                    <pic:cNvPr id="1" name=""/>
+                    <pic:cNvPicPr/>
+                  </pic:nvPicPr>
+                  <pic:blipFill>
+                    <a:blip r:embed="rId11">
+                      <a:extLst>
+                        <a:ext uri="{28A0092B-C50C-407E-A947-70E740481C1C}">
+                          <a14:useLocalDpi xmlns:a14="http://schemas.microsoft.com/office/drawing/2010/main" val="0"/>
+                        </a:ext>
+                      </a:extLst>
+                    </a:blip>
+                    <a:stretch>
+                      <a:fillRect/>
+                    </a:stretch>
+                  </pic:blipFill>
+                  <pic:spPr>
+                    <a:xfrm>
+                      <a:off x="0" y="0"/>
+                      <a:ext cx="3620453" cy="1717372"/>
+                    </a:xfrm>
+                    <a:prstGeom prst="rect">
+                      <a:avLst/>
+                    </a:prstGeom>
+                    <a:ln w="38100" cap="sq">
+                      <a:solidFill>
+                        <a:srgbClr val="000000"/>
+                      </a:solidFill>
+                      <a:prstDash val="solid"/>
+                      <a:miter lim="800000"/>
+                    </a:ln>
+                    <a:effectLst>
+                      <a:outerShdw blurRad="50800" dist="38100" dir="2700000" algn="tl" rotWithShape="0">
+                        <a:srgbClr val="000000">
+                          <a:alpha val="43000"/>
+                        </a:srgbClr>
+                      </a:outerShdw>
+                    </a:effectLst>
+                  </pic:spPr>
+                </pic:pic>
+              </a:graphicData>
+            </a:graphic>
+            <wp14:sizeRelH relativeFrom="margin">
+              <wp14:pctWidth>0</wp14:pctWidth>
+            </wp14:sizeRelH>
+            <wp14:sizeRelV relativeFrom="margin">
+              <wp14:pctHeight>0</wp14:pctHeight>
+            </wp14:sizeRelV>
+          </wp:anchor>
+        </w:drawing>
+      </w:r>
+    </w:p>
+    <w:p>
+      <w:pPr>
+        <w:tabs>
+          <w:tab w:val="left" w:pos="3040"/>
+        </w:tabs>
+      </w:pPr>
+      <w:r>
+        <w:rPr>
+          <w:noProof/>
+        </w:rPr>
+        <w:drawing>
+          <wp:anchor distT="0" distB="0" distL="114300" distR="114300" simplePos="0" relativeHeight="251661312" behindDoc="0" locked="0" layoutInCell="1" allowOverlap="1" wp14:anchorId="44601585" wp14:editId="3BDD817A">
+            <wp:simplePos x="0" y="0"/>
+            <wp:positionH relativeFrom="margin">
+              <wp:posOffset>-467917</wp:posOffset>
+            </wp:positionH>
+            <wp:positionV relativeFrom="paragraph">
+              <wp:posOffset>1740256</wp:posOffset>
+            </wp:positionV>
+            <wp:extent cx="6764344" cy="436917"/>
+            <wp:effectExtent l="76200" t="76200" r="132080" b="134620"/>
+            <wp:wrapNone/>
+            <wp:docPr id="4" name="Picture 4"/>
+            <wp:cNvGraphicFramePr>
+              <a:graphicFrameLocks xmlns:a="http://schemas.openxmlformats.org/drawingml/2006/main" noChangeAspect="1"/>
+            </wp:cNvGraphicFramePr>
+            <a:graphic xmlns:a="http://schemas.openxmlformats.org/drawingml/2006/main">
+              <a:graphicData uri="http://schemas.openxmlformats.org/drawingml/2006/picture">
+                <pic:pic xmlns:pic="http://schemas.openxmlformats.org/drawingml/2006/picture">
+                  <pic:nvPicPr>
+                    <pic:cNvPr id="1" name=""/>
+                    <pic:cNvPicPr/>
+                  </pic:nvPicPr>
+                  <pic:blipFill>
+                    <a:blip r:embed="rId12">
+                      <a:extLst>
+                        <a:ext uri="{28A0092B-C50C-407E-A947-70E740481C1C}">
+                          <a14:useLocalDpi xmlns:a14="http://schemas.microsoft.com/office/drawing/2010/main" val="0"/>
+                        </a:ext>
+                      </a:extLst>
+                    </a:blip>
+                    <a:stretch>
+                      <a:fillRect/>
+                    </a:stretch>
+                  </pic:blipFill>
+                  <pic:spPr>
+                    <a:xfrm>
+                      <a:off x="0" y="0"/>
+                      <a:ext cx="6764344" cy="436917"/>
+                    </a:xfrm>
+                    <a:prstGeom prst="rect">
+                      <a:avLst/>
+                    </a:prstGeom>
+                    <a:ln w="38100" cap="sq">
+                      <a:solidFill>
+                        <a:srgbClr val="000000"/>
+                      </a:solidFill>
+                      <a:prstDash val="solid"/>
+                      <a:miter lim="800000"/>
+                    </a:ln>
+                    <a:effectLst>
+                      <a:outerShdw blurRad="50800" dist="38100" dir="2700000" algn="tl" rotWithShape="0">
+                        <a:srgbClr val="000000">
+                          <a:alpha val="43000"/>
+                        </a:srgbClr>
+                      </a:outerShdw>
+                    </a:effectLst>
+                  </pic:spPr>
+                </pic:pic>
+              </a:graphicData>
+            </a:graphic>
+            <wp14:sizeRelH relativeFrom="margin">
+              <wp14:pctWidth>0</wp14:pctWidth>
+            </wp14:sizeRelH>
+            <wp14:sizeRelV relativeFrom="margin">
+              <wp14:pctHeight>0</wp14:pctHeight>
+            </wp14:sizeRelV>
+          </wp:anchor>
+        </w:drawing>
+      </w:r>
+      <w:r>
+        <w:tab/>
+      </w:r>
+    </w:p>
+    <w:p>
+      <w:pPr>
+        <w:tabs>
+          <w:tab w:val="left" w:pos="3040"/>
+        </w:tabs>
+      </w:pPr>
+    </w:p>
+    <w:p>
+      <w:pPr>
+        <w:tabs>
+          <w:tab w:val="left" w:pos="3040"/>
+        </w:tabs>
+      </w:pPr>
+    </w:p>
+    <w:p>
+      <w:pPr>
+        <w:tabs>
+          <w:tab w:val="left" w:pos="3040"/>
+        </w:tabs>
+      </w:pPr>
+    </w:p>
+    <w:p>
+      <w:pPr>
+        <w:tabs>
+          <w:tab w:val="left" w:pos="3040"/>
+        </w:tabs>
+      </w:pPr>
+    </w:p>
+    <w:p>
+      <w:pPr>
+        <w:tabs>
+          <w:tab w:val="left" w:pos="3040"/>
+        </w:tabs>
+      </w:pPr>
+      <w:r>
+        <w:rPr>
+          <w:noProof/>
+        </w:rPr>
+        <w:lastRenderedPageBreak/>
+        <w:drawing>
+          <wp:anchor distT="0" distB="0" distL="114300" distR="114300" simplePos="0" relativeHeight="251672576" behindDoc="0" locked="0" layoutInCell="1" allowOverlap="1" wp14:anchorId="2968AB03" wp14:editId="6142E933">
+            <wp:simplePos x="0" y="0"/>
+            <wp:positionH relativeFrom="column">
+              <wp:posOffset>-806395</wp:posOffset>
+            </wp:positionH>
+            <wp:positionV relativeFrom="paragraph">
+              <wp:posOffset>-750736</wp:posOffset>
+            </wp:positionV>
+            <wp:extent cx="7130342" cy="4002819"/>
+            <wp:effectExtent l="76200" t="76200" r="128270" b="131445"/>
+            <wp:wrapNone/>
+            <wp:docPr id="16" name="Picture 16"/>
+            <wp:cNvGraphicFramePr>
+              <a:graphicFrameLocks xmlns:a="http://schemas.openxmlformats.org/drawingml/2006/main" noChangeAspect="1"/>
+            </wp:cNvGraphicFramePr>
+            <a:graphic xmlns:a="http://schemas.openxmlformats.org/drawingml/2006/main">
+              <a:graphicData uri="http://schemas.openxmlformats.org/drawingml/2006/picture">
+                <pic:pic xmlns:pic="http://schemas.openxmlformats.org/drawingml/2006/picture">
+                  <pic:nvPicPr>
+                    <pic:cNvPr id="1" name=""/>
+                    <pic:cNvPicPr/>
+                  </pic:nvPicPr>
+                  <pic:blipFill>
+                    <a:blip r:embed="rId13" cstate="print">
+                      <a:extLst>
+                        <a:ext uri="{28A0092B-C50C-407E-A947-70E740481C1C}">
+                          <a14:useLocalDpi xmlns:a14="http://schemas.microsoft.com/office/drawing/2010/main" val="0"/>
+                        </a:ext>
+                      </a:extLst>
+                    </a:blip>
+                    <a:stretch>
+                      <a:fillRect/>
+                    </a:stretch>
+                  </pic:blipFill>
+                  <pic:spPr>
+                    <a:xfrm>
+                      <a:off x="0" y="0"/>
+                      <a:ext cx="7149347" cy="4013488"/>
+                    </a:xfrm>
+                    <a:prstGeom prst="rect">
+                      <a:avLst/>
+                    </a:prstGeom>
+                    <a:ln w="38100" cap="sq">
+                      <a:solidFill>
+                        <a:srgbClr val="000000"/>
+                      </a:solidFill>
+                      <a:prstDash val="solid"/>
+                      <a:miter lim="800000"/>
+                    </a:ln>
+                    <a:effectLst>
+                      <a:outerShdw blurRad="50800" dist="38100" dir="2700000" algn="tl" rotWithShape="0">
+                        <a:srgbClr val="000000">
+                          <a:alpha val="43000"/>
+                        </a:srgbClr>
+                      </a:outerShdw>
+                    </a:effectLst>
+                  </pic:spPr>
+                </pic:pic>
+              </a:graphicData>
+            </a:graphic>
+            <wp14:sizeRelH relativeFrom="margin">
+              <wp14:pctWidth>0</wp14:pctWidth>
+            </wp14:sizeRelH>
+            <wp14:sizeRelV relativeFrom="margin">
+              <wp14:pctHeight>0</wp14:pctHeight>
+            </wp14:sizeRelV>
+          </wp:anchor>
+        </w:drawing>
+      </w:r>
+    </w:p>
+    <w:p>
+      <w:pPr>
+        <w:tabs>
+          <w:tab w:val="left" w:pos="3040"/>
+        </w:tabs>
+      </w:pPr>
+    </w:p>
+    <w:p>
+      <w:pPr>
+        <w:tabs>
+          <w:tab w:val="left" w:pos="3040"/>
+        </w:tabs>
+        <w:rPr>
+          <w:noProof/>
+        </w:rPr>
+      </w:pPr>
+    </w:p>
+    <w:p>
+      <w:pPr>
+        <w:tabs>
+          <w:tab w:val="left" w:pos="3040"/>
+        </w:tabs>
+      </w:pPr>
+    </w:p>
+    <w:p>
+      <w:pPr>
+        <w:tabs>
+          <w:tab w:val="left" w:pos="3040"/>
+        </w:tabs>
+      </w:pPr>
+    </w:p>
+    <w:p>
+      <w:pPr>
+        <w:tabs>
+          <w:tab w:val="left" w:pos="3040"/>
+        </w:tabs>
+      </w:pPr>
+    </w:p>
+    <w:p>
+      <w:pPr>
+        <w:tabs>
+          <w:tab w:val="left" w:pos="3040"/>
+        </w:tabs>
+      </w:pPr>
+    </w:p>
+    <w:p>
+      <w:pPr>
+        <w:tabs>
+          <w:tab w:val="left" w:pos="3040"/>
+        </w:tabs>
+      </w:pPr>
+    </w:p>
+    <w:p>
+      <w:pPr>
+        <w:tabs>
+          <w:tab w:val="left" w:pos="3040"/>
+        </w:tabs>
+      </w:pPr>
+    </w:p>
+    <w:p>
+      <w:pPr>
+        <w:tabs>
+          <w:tab w:val="left" w:pos="3040"/>
+        </w:tabs>
+      </w:pPr>
+    </w:p>
+    <w:p>
+      <w:pPr>
+        <w:tabs>
+          <w:tab w:val="left" w:pos="3040"/>
+        </w:tabs>
+      </w:pPr>
+    </w:p>
+    <w:p>
+      <w:pPr>
+        <w:tabs>
+          <w:tab w:val="left" w:pos="3040"/>
+        </w:tabs>
+      </w:pPr>
+      <w:r>
+        <w:rPr>
+          <w:noProof/>
+        </w:rPr>
+        <w:drawing>
+          <wp:anchor distT="0" distB="0" distL="114300" distR="114300" simplePos="0" relativeHeight="251673600" behindDoc="0" locked="0" layoutInCell="1" allowOverlap="1" wp14:anchorId="2B96D568" wp14:editId="61D91D38">
+            <wp:simplePos x="0" y="0"/>
+            <wp:positionH relativeFrom="page">
+              <wp:align>left</wp:align>
+            </wp:positionH>
+            <wp:positionV relativeFrom="paragraph">
+              <wp:posOffset>261758</wp:posOffset>
+            </wp:positionV>
+            <wp:extent cx="7144507" cy="4010771"/>
+            <wp:effectExtent l="76200" t="76200" r="132715" b="142240"/>
+            <wp:wrapNone/>
+            <wp:docPr id="17" name="Picture 17"/>
+            <wp:cNvGraphicFramePr>
+              <a:graphicFrameLocks xmlns:a="http://schemas.openxmlformats.org/drawingml/2006/main" noChangeAspect="1"/>
+            </wp:cNvGraphicFramePr>
+            <a:graphic xmlns:a="http://schemas.openxmlformats.org/drawingml/2006/main">
+              <a:graphicData uri="http://schemas.openxmlformats.org/drawingml/2006/picture">
+                <pic:pic xmlns:pic="http://schemas.openxmlformats.org/drawingml/2006/picture">
+                  <pic:nvPicPr>
+                    <pic:cNvPr id="1" name=""/>
+                    <pic:cNvPicPr/>
+                  </pic:nvPicPr>
+                  <pic:blipFill>
+                    <a:blip r:embed="rId14" cstate="print">
+                      <a:extLst>
+                        <a:ext uri="{28A0092B-C50C-407E-A947-70E740481C1C}">
+                          <a14:useLocalDpi xmlns:a14="http://schemas.microsoft.com/office/drawing/2010/main" val="0"/>
+                        </a:ext>
+                      </a:extLst>
+                    </a:blip>
+                    <a:stretch>
+                      <a:fillRect/>
+                    </a:stretch>
+                  </pic:blipFill>
+                  <pic:spPr>
+                    <a:xfrm>
+                      <a:off x="0" y="0"/>
+                      <a:ext cx="7165237" cy="4022408"/>
+                    </a:xfrm>
+                    <a:prstGeom prst="rect">
+                      <a:avLst/>
+                    </a:prstGeom>
+                    <a:ln w="38100" cap="sq">
+                      <a:solidFill>
+                        <a:srgbClr val="000000"/>
+                      </a:solidFill>
+                      <a:prstDash val="solid"/>
+                      <a:miter lim="800000"/>
+                    </a:ln>
+                    <a:effectLst>
+                      <a:outerShdw blurRad="50800" dist="38100" dir="2700000" algn="tl" rotWithShape="0">
+                        <a:srgbClr val="000000">
+                          <a:alpha val="43000"/>
+                        </a:srgbClr>
+                      </a:outerShdw>
+                    </a:effectLst>
+                  </pic:spPr>
+                </pic:pic>
+              </a:graphicData>
+            </a:graphic>
+            <wp14:sizeRelH relativeFrom="margin">
+              <wp14:pctWidth>0</wp14:pctWidth>
+            </wp14:sizeRelH>
+            <wp14:sizeRelV relativeFrom="margin">
+              <wp14:pctHeight>0</wp14:pctHeight>
+            </wp14:sizeRelV>
+          </wp:anchor>
+        </w:drawing>
+      </w:r>
+    </w:p>
+    <w:p>
+      <w:pPr>
+        <w:tabs>
+          <w:tab w:val="left" w:pos="3040"/>
+        </w:tabs>
+      </w:pPr>
+    </w:p>
+    <w:p>
+      <w:pPr>
+        <w:tabs>
+          <w:tab w:val="left" w:pos="3040"/>
+        </w:tabs>
+      </w:pPr>
+    </w:p>
+    <w:p>
+      <w:pPr>
+        <w:tabs>
+          <w:tab w:val="left" w:pos="3040"/>
+        </w:tabs>
+      </w:pPr>
+    </w:p>
+    <w:p>
+      <w:pPr>
+        <w:tabs>
+          <w:tab w:val="left" w:pos="3040"/>
+        </w:tabs>
+      </w:pPr>
+    </w:p>
+    <w:p>
+      <w:pPr>
+        <w:tabs>
+          <w:tab w:val="left" w:pos="3040"/>
+        </w:tabs>
+      </w:pPr>
+    </w:p>
+    <w:p>
+      <w:pPr>
+        <w:tabs>
+          <w:tab w:val="left" w:pos="3040"/>
+        </w:tabs>
+      </w:pPr>
+    </w:p>
+    <w:p>
+      <w:pPr>
+        <w:tabs>
+          <w:tab w:val="left" w:pos="3040"/>
+        </w:tabs>
+      </w:pPr>
+    </w:p>
+    <w:p>
+      <w:pPr>
+        <w:tabs>
+          <w:tab w:val="left" w:pos="3040"/>
+        </w:tabs>
+      </w:pPr>
+    </w:p>
+    <w:p>
+      <w:pPr>
+        <w:tabs>
+          <w:tab w:val="left" w:pos="3040"/>
+        </w:tabs>
+      </w:pPr>
+    </w:p>
+    <w:p>
+      <w:pPr>
+        <w:tabs>
+          <w:tab w:val="left" w:pos="3040"/>
+        </w:tabs>
+      </w:pPr>
+    </w:p>
+    <w:p>
+      <w:pPr>
+        <w:tabs>
+          <w:tab w:val="left" w:pos="3040"/>
+        </w:tabs>
+      </w:pPr>
+    </w:p>
+    <w:p>
+      <w:pPr>
+        <w:tabs>
+          <w:tab w:val="left" w:pos="3040"/>
+        </w:tabs>
+      </w:pPr>
+    </w:p>
+    <w:p>
+      <w:pPr>
+        <w:tabs>
+          <w:tab w:val="left" w:pos="3040"/>
+        </w:tabs>
+      </w:pPr>
+    </w:p>
+    <w:p>
+      <w:pPr>
+        <w:tabs>
+          <w:tab w:val="left" w:pos="3040"/>
+        </w:tabs>
+      </w:pPr>
+    </w:p>
+    <w:p>
+      <w:pPr>
+        <w:tabs>
+          <w:tab w:val="left" w:pos="3040"/>
+        </w:tabs>
+      </w:pPr>
+      <w:r>
+        <w:rPr>
+          <w:noProof/>
+        </w:rPr>
+        <w:drawing>
+          <wp:anchor distT="0" distB="0" distL="114300" distR="114300" simplePos="0" relativeHeight="251668480" behindDoc="0" locked="0" layoutInCell="1" allowOverlap="1" wp14:anchorId="369A19EE" wp14:editId="409A6144">
+            <wp:simplePos x="0" y="0"/>
+            <wp:positionH relativeFrom="column">
+              <wp:posOffset>-825887</wp:posOffset>
+            </wp:positionH>
+            <wp:positionV relativeFrom="paragraph">
+              <wp:posOffset>177303</wp:posOffset>
+            </wp:positionV>
+            <wp:extent cx="3607713" cy="1711329"/>
+            <wp:effectExtent l="76200" t="76200" r="126365" b="136525"/>
+            <wp:wrapNone/>
+            <wp:docPr id="11" name="Picture 11"/>
+            <wp:cNvGraphicFramePr>
+              <a:graphicFrameLocks xmlns:a="http://schemas.openxmlformats.org/drawingml/2006/main" noChangeAspect="1"/>
+            </wp:cNvGraphicFramePr>
+            <a:graphic xmlns:a="http://schemas.openxmlformats.org/drawingml/2006/main">
+              <a:graphicData uri="http://schemas.openxmlformats.org/drawingml/2006/picture">
+                <pic:pic xmlns:pic="http://schemas.openxmlformats.org/drawingml/2006/picture">
+                  <pic:nvPicPr>
+                    <pic:cNvPr id="1" name=""/>
+                    <pic:cNvPicPr/>
+                  </pic:nvPicPr>
+                  <pic:blipFill>
+                    <a:blip r:embed="rId11">
+                      <a:extLst>
+                        <a:ext uri="{28A0092B-C50C-407E-A947-70E740481C1C}">
+                          <a14:useLocalDpi xmlns:a14="http://schemas.microsoft.com/office/drawing/2010/main" val="0"/>
+                        </a:ext>
+                      </a:extLst>
+                    </a:blip>
+                    <a:stretch>
+                      <a:fillRect/>
+                    </a:stretch>
+                  </pic:blipFill>
+                  <pic:spPr>
+                    <a:xfrm>
+                      <a:off x="0" y="0"/>
+                      <a:ext cx="3607713" cy="1711329"/>
                     </a:xfrm>
                     <a:prstGeom prst="rect">
                       <a:avLst/>
@@ -163,18 +934,18 @@
           <w:noProof/>
         </w:rPr>
         <w:drawing>
-          <wp:anchor distT="0" distB="0" distL="114300" distR="114300" simplePos="0" relativeHeight="251687936" behindDoc="0" locked="0" layoutInCell="1" allowOverlap="1" wp14:anchorId="714B0F08" wp14:editId="1FA02CD3">
+          <wp:anchor distT="0" distB="0" distL="114300" distR="114300" simplePos="0" relativeHeight="251666432" behindDoc="0" locked="0" layoutInCell="1" allowOverlap="1" wp14:anchorId="1F13F862" wp14:editId="63BE823E">
             <wp:simplePos x="0" y="0"/>
             <wp:positionH relativeFrom="page">
-              <wp:align>left</wp:align>
+              <wp:align>right</wp:align>
             </wp:positionH>
             <wp:positionV relativeFrom="paragraph">
-              <wp:posOffset>499745</wp:posOffset>
+              <wp:posOffset>179263</wp:posOffset>
             </wp:positionV>
-            <wp:extent cx="7357651" cy="891540"/>
-            <wp:effectExtent l="76200" t="76200" r="129540" b="137160"/>
+            <wp:extent cx="3638421" cy="1895723"/>
+            <wp:effectExtent l="76200" t="76200" r="133985" b="123825"/>
             <wp:wrapNone/>
-            <wp:docPr id="21" name="Picture 21"/>
+            <wp:docPr id="10" name="Picture 10"/>
             <wp:cNvGraphicFramePr>
               <a:graphicFrameLocks xmlns:a="http://schemas.openxmlformats.org/drawingml/2006/main" noChangeAspect="1"/>
             </wp:cNvGraphicFramePr>
@@ -182,28 +953,465 @@
               <a:graphicData uri="http://schemas.openxmlformats.org/drawingml/2006/picture">
                 <pic:pic xmlns:pic="http://schemas.openxmlformats.org/drawingml/2006/picture">
                   <pic:nvPicPr>
-                    <pic:cNvPr id="0" name="Picture 2"/>
-                    <pic:cNvPicPr>
-                      <a:picLocks noChangeAspect="1" noChangeArrowheads="1"/>
-                    </pic:cNvPicPr>
+                    <pic:cNvPr id="1" name=""/>
+                    <pic:cNvPicPr/>
                   </pic:nvPicPr>
                   <pic:blipFill>
-                    <a:blip r:embed="rId9" cstate="print">
+                    <a:blip r:embed="rId15">
                       <a:extLst>
                         <a:ext uri="{28A0092B-C50C-407E-A947-70E740481C1C}">
                           <a14:useLocalDpi xmlns:a14="http://schemas.microsoft.com/office/drawing/2010/main" val="0"/>
                         </a:ext>
                       </a:extLst>
                     </a:blip>
-                    <a:srcRect/>
                     <a:stretch>
                       <a:fillRect/>
                     </a:stretch>
                   </pic:blipFill>
-                  <pic:spPr bwMode="auto">
+                  <pic:spPr>
                     <a:xfrm>
                       <a:off x="0" y="0"/>
-                      <a:ext cx="7403207" cy="897060"/>
+                      <a:ext cx="3638421" cy="1895723"/>
+                    </a:xfrm>
+                    <a:prstGeom prst="rect">
+                      <a:avLst/>
+                    </a:prstGeom>
+                    <a:ln w="38100" cap="sq">
+                      <a:solidFill>
+                        <a:srgbClr val="000000"/>
+                      </a:solidFill>
+                      <a:prstDash val="solid"/>
+                      <a:miter lim="800000"/>
+                    </a:ln>
+                    <a:effectLst>
+                      <a:outerShdw blurRad="50800" dist="38100" dir="2700000" algn="tl" rotWithShape="0">
+                        <a:srgbClr val="000000">
+                          <a:alpha val="43000"/>
+                        </a:srgbClr>
+                      </a:outerShdw>
+                    </a:effectLst>
+                  </pic:spPr>
+                </pic:pic>
+              </a:graphicData>
+            </a:graphic>
+            <wp14:sizeRelH relativeFrom="margin">
+              <wp14:pctWidth>0</wp14:pctWidth>
+            </wp14:sizeRelH>
+            <wp14:sizeRelV relativeFrom="margin">
+              <wp14:pctHeight>0</wp14:pctHeight>
+            </wp14:sizeRelV>
+          </wp:anchor>
+        </w:drawing>
+      </w:r>
+    </w:p>
+    <w:p>
+      <w:pPr>
+        <w:tabs>
+          <w:tab w:val="left" w:pos="3040"/>
+        </w:tabs>
+      </w:pPr>
+    </w:p>
+    <w:p>
+      <w:pPr>
+        <w:tabs>
+          <w:tab w:val="left" w:pos="3040"/>
+        </w:tabs>
+      </w:pPr>
+    </w:p>
+    <w:p>
+      <w:pPr>
+        <w:tabs>
+          <w:tab w:val="left" w:pos="3040"/>
+        </w:tabs>
+      </w:pPr>
+    </w:p>
+    <w:p>
+      <w:pPr>
+        <w:tabs>
+          <w:tab w:val="left" w:pos="3040"/>
+        </w:tabs>
+      </w:pPr>
+    </w:p>
+    <w:p>
+      <w:pPr>
+        <w:tabs>
+          <w:tab w:val="left" w:pos="3040"/>
+        </w:tabs>
+      </w:pPr>
+      <w:r>
+        <w:rPr>
+          <w:noProof/>
+        </w:rPr>
+        <w:lastRenderedPageBreak/>
+        <w:drawing>
+          <wp:anchor distT="0" distB="0" distL="114300" distR="114300" simplePos="0" relativeHeight="251674624" behindDoc="0" locked="0" layoutInCell="1" allowOverlap="1" wp14:anchorId="1BCF34FE" wp14:editId="61E83F3F">
+            <wp:simplePos x="0" y="0"/>
+            <wp:positionH relativeFrom="column">
+              <wp:posOffset>-774590</wp:posOffset>
+            </wp:positionH>
+            <wp:positionV relativeFrom="paragraph">
+              <wp:posOffset>-742784</wp:posOffset>
+            </wp:positionV>
+            <wp:extent cx="7172834" cy="4026673"/>
+            <wp:effectExtent l="76200" t="76200" r="142875" b="126365"/>
+            <wp:wrapNone/>
+            <wp:docPr id="18" name="Picture 18"/>
+            <wp:cNvGraphicFramePr>
+              <a:graphicFrameLocks xmlns:a="http://schemas.openxmlformats.org/drawingml/2006/main" noChangeAspect="1"/>
+            </wp:cNvGraphicFramePr>
+            <a:graphic xmlns:a="http://schemas.openxmlformats.org/drawingml/2006/main">
+              <a:graphicData uri="http://schemas.openxmlformats.org/drawingml/2006/picture">
+                <pic:pic xmlns:pic="http://schemas.openxmlformats.org/drawingml/2006/picture">
+                  <pic:nvPicPr>
+                    <pic:cNvPr id="1" name=""/>
+                    <pic:cNvPicPr/>
+                  </pic:nvPicPr>
+                  <pic:blipFill>
+                    <a:blip r:embed="rId16" cstate="print">
+                      <a:extLst>
+                        <a:ext uri="{28A0092B-C50C-407E-A947-70E740481C1C}">
+                          <a14:useLocalDpi xmlns:a14="http://schemas.microsoft.com/office/drawing/2010/main" val="0"/>
+                        </a:ext>
+                      </a:extLst>
+                    </a:blip>
+                    <a:stretch>
+                      <a:fillRect/>
+                    </a:stretch>
+                  </pic:blipFill>
+                  <pic:spPr>
+                    <a:xfrm>
+                      <a:off x="0" y="0"/>
+                      <a:ext cx="7188354" cy="4035386"/>
+                    </a:xfrm>
+                    <a:prstGeom prst="rect">
+                      <a:avLst/>
+                    </a:prstGeom>
+                    <a:ln w="38100" cap="sq">
+                      <a:solidFill>
+                        <a:srgbClr val="000000"/>
+                      </a:solidFill>
+                      <a:prstDash val="solid"/>
+                      <a:miter lim="800000"/>
+                    </a:ln>
+                    <a:effectLst>
+                      <a:outerShdw blurRad="50800" dist="38100" dir="2700000" algn="tl" rotWithShape="0">
+                        <a:srgbClr val="000000">
+                          <a:alpha val="43000"/>
+                        </a:srgbClr>
+                      </a:outerShdw>
+                    </a:effectLst>
+                  </pic:spPr>
+                </pic:pic>
+              </a:graphicData>
+            </a:graphic>
+            <wp14:sizeRelH relativeFrom="margin">
+              <wp14:pctWidth>0</wp14:pctWidth>
+            </wp14:sizeRelH>
+            <wp14:sizeRelV relativeFrom="margin">
+              <wp14:pctHeight>0</wp14:pctHeight>
+            </wp14:sizeRelV>
+          </wp:anchor>
+        </w:drawing>
+      </w:r>
+    </w:p>
+    <w:p>
+      <w:pPr>
+        <w:tabs>
+          <w:tab w:val="left" w:pos="3040"/>
+        </w:tabs>
+      </w:pPr>
+    </w:p>
+    <w:p>
+      <w:pPr>
+        <w:tabs>
+          <w:tab w:val="left" w:pos="3040"/>
+        </w:tabs>
+      </w:pPr>
+    </w:p>
+    <w:p>
+      <w:pPr>
+        <w:tabs>
+          <w:tab w:val="left" w:pos="3040"/>
+        </w:tabs>
+      </w:pPr>
+    </w:p>
+    <w:p>
+      <w:pPr>
+        <w:tabs>
+          <w:tab w:val="left" w:pos="3040"/>
+        </w:tabs>
+      </w:pPr>
+    </w:p>
+    <w:p>
+      <w:pPr>
+        <w:tabs>
+          <w:tab w:val="left" w:pos="3040"/>
+        </w:tabs>
+      </w:pPr>
+    </w:p>
+    <w:p>
+      <w:pPr>
+        <w:tabs>
+          <w:tab w:val="left" w:pos="3040"/>
+        </w:tabs>
+      </w:pPr>
+    </w:p>
+    <w:p>
+      <w:pPr>
+        <w:tabs>
+          <w:tab w:val="left" w:pos="3040"/>
+        </w:tabs>
+      </w:pPr>
+    </w:p>
+    <w:p>
+      <w:pPr>
+        <w:tabs>
+          <w:tab w:val="left" w:pos="3040"/>
+        </w:tabs>
+      </w:pPr>
+    </w:p>
+    <w:p>
+      <w:pPr>
+        <w:tabs>
+          <w:tab w:val="left" w:pos="3040"/>
+        </w:tabs>
+      </w:pPr>
+    </w:p>
+    <w:p>
+      <w:pPr>
+        <w:tabs>
+          <w:tab w:val="left" w:pos="3040"/>
+        </w:tabs>
+      </w:pPr>
+    </w:p>
+    <w:p>
+      <w:pPr>
+        <w:tabs>
+          <w:tab w:val="left" w:pos="3040"/>
+        </w:tabs>
+      </w:pPr>
+      <w:r>
+        <w:rPr>
+          <w:noProof/>
+        </w:rPr>
+        <w:drawing>
+          <wp:anchor distT="0" distB="0" distL="114300" distR="114300" simplePos="0" relativeHeight="251675648" behindDoc="0" locked="0" layoutInCell="1" allowOverlap="1" wp14:anchorId="3B9E5AC0" wp14:editId="6B637765">
+            <wp:simplePos x="0" y="0"/>
+            <wp:positionH relativeFrom="column">
+              <wp:posOffset>-790493</wp:posOffset>
+            </wp:positionH>
+            <wp:positionV relativeFrom="paragraph">
+              <wp:posOffset>273768</wp:posOffset>
+            </wp:positionV>
+            <wp:extent cx="7116179" cy="3994868"/>
+            <wp:effectExtent l="76200" t="76200" r="142240" b="139065"/>
+            <wp:wrapNone/>
+            <wp:docPr id="19" name="Picture 19"/>
+            <wp:cNvGraphicFramePr>
+              <a:graphicFrameLocks xmlns:a="http://schemas.openxmlformats.org/drawingml/2006/main" noChangeAspect="1"/>
+            </wp:cNvGraphicFramePr>
+            <a:graphic xmlns:a="http://schemas.openxmlformats.org/drawingml/2006/main">
+              <a:graphicData uri="http://schemas.openxmlformats.org/drawingml/2006/picture">
+                <pic:pic xmlns:pic="http://schemas.openxmlformats.org/drawingml/2006/picture">
+                  <pic:nvPicPr>
+                    <pic:cNvPr id="1" name=""/>
+                    <pic:cNvPicPr/>
+                  </pic:nvPicPr>
+                  <pic:blipFill>
+                    <a:blip r:embed="rId17" cstate="print">
+                      <a:extLst>
+                        <a:ext uri="{28A0092B-C50C-407E-A947-70E740481C1C}">
+                          <a14:useLocalDpi xmlns:a14="http://schemas.microsoft.com/office/drawing/2010/main" val="0"/>
+                        </a:ext>
+                      </a:extLst>
+                    </a:blip>
+                    <a:stretch>
+                      <a:fillRect/>
+                    </a:stretch>
+                  </pic:blipFill>
+                  <pic:spPr>
+                    <a:xfrm>
+                      <a:off x="0" y="0"/>
+                      <a:ext cx="7133026" cy="4004325"/>
+                    </a:xfrm>
+                    <a:prstGeom prst="rect">
+                      <a:avLst/>
+                    </a:prstGeom>
+                    <a:ln w="38100" cap="sq">
+                      <a:solidFill>
+                        <a:srgbClr val="000000"/>
+                      </a:solidFill>
+                      <a:prstDash val="solid"/>
+                      <a:miter lim="800000"/>
+                    </a:ln>
+                    <a:effectLst>
+                      <a:outerShdw blurRad="50800" dist="38100" dir="2700000" algn="tl" rotWithShape="0">
+                        <a:srgbClr val="000000">
+                          <a:alpha val="43000"/>
+                        </a:srgbClr>
+                      </a:outerShdw>
+                    </a:effectLst>
+                  </pic:spPr>
+                </pic:pic>
+              </a:graphicData>
+            </a:graphic>
+            <wp14:sizeRelH relativeFrom="margin">
+              <wp14:pctWidth>0</wp14:pctWidth>
+            </wp14:sizeRelH>
+            <wp14:sizeRelV relativeFrom="margin">
+              <wp14:pctHeight>0</wp14:pctHeight>
+            </wp14:sizeRelV>
+          </wp:anchor>
+        </w:drawing>
+      </w:r>
+    </w:p>
+    <w:p>
+      <w:pPr>
+        <w:tabs>
+          <w:tab w:val="left" w:pos="3040"/>
+        </w:tabs>
+      </w:pPr>
+    </w:p>
+    <w:p>
+      <w:pPr>
+        <w:tabs>
+          <w:tab w:val="left" w:pos="3040"/>
+        </w:tabs>
+      </w:pPr>
+    </w:p>
+    <w:p>
+      <w:pPr>
+        <w:tabs>
+          <w:tab w:val="left" w:pos="3040"/>
+        </w:tabs>
+      </w:pPr>
+    </w:p>
+    <w:p>
+      <w:pPr>
+        <w:tabs>
+          <w:tab w:val="left" w:pos="3040"/>
+        </w:tabs>
+      </w:pPr>
+    </w:p>
+    <w:p>
+      <w:pPr>
+        <w:tabs>
+          <w:tab w:val="left" w:pos="3040"/>
+        </w:tabs>
+      </w:pPr>
+    </w:p>
+    <w:p>
+      <w:pPr>
+        <w:tabs>
+          <w:tab w:val="left" w:pos="3040"/>
+        </w:tabs>
+      </w:pPr>
+    </w:p>
+    <w:p>
+      <w:pPr>
+        <w:tabs>
+          <w:tab w:val="left" w:pos="3040"/>
+        </w:tabs>
+      </w:pPr>
+    </w:p>
+    <w:p>
+      <w:pPr>
+        <w:tabs>
+          <w:tab w:val="left" w:pos="3040"/>
+        </w:tabs>
+      </w:pPr>
+    </w:p>
+    <w:p>
+      <w:pPr>
+        <w:tabs>
+          <w:tab w:val="left" w:pos="3040"/>
+        </w:tabs>
+      </w:pPr>
+    </w:p>
+    <w:p>
+      <w:pPr>
+        <w:tabs>
+          <w:tab w:val="left" w:pos="3040"/>
+        </w:tabs>
+      </w:pPr>
+    </w:p>
+    <w:p>
+      <w:pPr>
+        <w:tabs>
+          <w:tab w:val="left" w:pos="3040"/>
+        </w:tabs>
+      </w:pPr>
+    </w:p>
+    <w:p>
+      <w:pPr>
+        <w:tabs>
+          <w:tab w:val="left" w:pos="3040"/>
+        </w:tabs>
+      </w:pPr>
+    </w:p>
+    <w:p>
+      <w:pPr>
+        <w:tabs>
+          <w:tab w:val="left" w:pos="3040"/>
+        </w:tabs>
+      </w:pPr>
+    </w:p>
+    <w:p>
+      <w:pPr>
+        <w:tabs>
+          <w:tab w:val="left" w:pos="3040"/>
+        </w:tabs>
+      </w:pPr>
+    </w:p>
+    <w:p>
+      <w:pPr>
+        <w:tabs>
+          <w:tab w:val="left" w:pos="3040"/>
+        </w:tabs>
+      </w:pPr>
+      <w:r>
+        <w:rPr>
+          <w:noProof/>
+        </w:rPr>
+        <w:drawing>
+          <wp:anchor distT="0" distB="0" distL="114300" distR="114300" simplePos="0" relativeHeight="251676672" behindDoc="0" locked="0" layoutInCell="1" allowOverlap="1" wp14:anchorId="616BA54C" wp14:editId="62A0EDB9">
+            <wp:simplePos x="0" y="0"/>
+            <wp:positionH relativeFrom="column">
+              <wp:posOffset>2635968</wp:posOffset>
+            </wp:positionH>
+            <wp:positionV relativeFrom="paragraph">
+              <wp:posOffset>163223</wp:posOffset>
+            </wp:positionV>
+            <wp:extent cx="3838019" cy="1800308"/>
+            <wp:effectExtent l="76200" t="76200" r="124460" b="142875"/>
+            <wp:wrapNone/>
+            <wp:docPr id="20" name="Picture 20"/>
+            <wp:cNvGraphicFramePr>
+              <a:graphicFrameLocks xmlns:a="http://schemas.openxmlformats.org/drawingml/2006/main" noChangeAspect="1"/>
+            </wp:cNvGraphicFramePr>
+            <a:graphic xmlns:a="http://schemas.openxmlformats.org/drawingml/2006/main">
+              <a:graphicData uri="http://schemas.openxmlformats.org/drawingml/2006/picture">
+                <pic:pic xmlns:pic="http://schemas.openxmlformats.org/drawingml/2006/picture">
+                  <pic:nvPicPr>
+                    <pic:cNvPr id="1" name=""/>
+                    <pic:cNvPicPr/>
+                  </pic:nvPicPr>
+                  <pic:blipFill>
+                    <a:blip r:embed="rId18">
+                      <a:extLst>
+                        <a:ext uri="{28A0092B-C50C-407E-A947-70E740481C1C}">
+                          <a14:useLocalDpi xmlns:a14="http://schemas.microsoft.com/office/drawing/2010/main" val="0"/>
+                        </a:ext>
+                      </a:extLst>
+                    </a:blip>
+                    <a:stretch>
+                      <a:fillRect/>
+                    </a:stretch>
+                  </pic:blipFill>
+                  <pic:spPr>
+                    <a:xfrm>
+                      <a:off x="0" y="0"/>
+                      <a:ext cx="3838019" cy="1800308"/>
                     </a:xfrm>
                     <a:prstGeom prst="rect">
                       <a:avLst/>
@@ -240,18 +1448,18 @@
           <w:noProof/>
         </w:rPr>
         <w:drawing>
-          <wp:anchor distT="0" distB="0" distL="114300" distR="114300" simplePos="0" relativeHeight="251688960" behindDoc="0" locked="0" layoutInCell="1" allowOverlap="1" wp14:anchorId="0D36A3FE" wp14:editId="4CA9C26D">
+          <wp:anchor distT="0" distB="0" distL="114300" distR="114300" simplePos="0" relativeHeight="251670528" behindDoc="0" locked="0" layoutInCell="1" allowOverlap="1" wp14:anchorId="6CDCAD76" wp14:editId="4D4EBCE8">
             <wp:simplePos x="0" y="0"/>
-            <wp:positionH relativeFrom="page">
-              <wp:align>right</wp:align>
+            <wp:positionH relativeFrom="column">
+              <wp:posOffset>-734833</wp:posOffset>
             </wp:positionH>
             <wp:positionV relativeFrom="paragraph">
-              <wp:posOffset>1650365</wp:posOffset>
+              <wp:posOffset>179760</wp:posOffset>
             </wp:positionV>
-            <wp:extent cx="7326003" cy="2308860"/>
-            <wp:effectExtent l="76200" t="76200" r="141605" b="129540"/>
+            <wp:extent cx="3235537" cy="1796272"/>
+            <wp:effectExtent l="76200" t="76200" r="136525" b="128270"/>
             <wp:wrapNone/>
-            <wp:docPr id="22" name="Picture 22"/>
+            <wp:docPr id="14" name="Picture 14"/>
             <wp:cNvGraphicFramePr>
               <a:graphicFrameLocks xmlns:a="http://schemas.openxmlformats.org/drawingml/2006/main" noChangeAspect="1"/>
             </wp:cNvGraphicFramePr>
@@ -259,28 +1467,25 @@
               <a:graphicData uri="http://schemas.openxmlformats.org/drawingml/2006/picture">
                 <pic:pic xmlns:pic="http://schemas.openxmlformats.org/drawingml/2006/picture">
                   <pic:nvPicPr>
-                    <pic:cNvPr id="0" name="Picture 3"/>
-                    <pic:cNvPicPr>
-                      <a:picLocks noChangeAspect="1" noChangeArrowheads="1"/>
-                    </pic:cNvPicPr>
+                    <pic:cNvPr id="1" name=""/>
+                    <pic:cNvPicPr/>
                   </pic:nvPicPr>
                   <pic:blipFill>
-                    <a:blip r:embed="rId10">
+                    <a:blip r:embed="rId19">
                       <a:extLst>
                         <a:ext uri="{28A0092B-C50C-407E-A947-70E740481C1C}">
                           <a14:useLocalDpi xmlns:a14="http://schemas.microsoft.com/office/drawing/2010/main" val="0"/>
                         </a:ext>
                       </a:extLst>
                     </a:blip>
-                    <a:srcRect/>
                     <a:stretch>
                       <a:fillRect/>
                     </a:stretch>
                   </pic:blipFill>
-                  <pic:spPr bwMode="auto">
+                  <pic:spPr>
                     <a:xfrm>
                       <a:off x="0" y="0"/>
-                      <a:ext cx="7326003" cy="2308860"/>
+                      <a:ext cx="3246931" cy="1802598"/>
                     </a:xfrm>
                     <a:prstGeom prst="rect">
                       <a:avLst/>
@@ -313,45 +1518,181 @@
         </w:drawing>
       </w:r>
     </w:p>
-    <w:p/>
-    <w:p/>
-    <w:p/>
-    <w:p/>
-    <w:p/>
-    <w:p/>
-    <w:p/>
-    <w:p/>
-    <w:p/>
-    <w:p/>
-    <w:p/>
-    <w:p/>
-    <w:p/>
-    <w:p/>
-    <w:p/>
-    <w:p/>
-    <w:p/>
-    <w:p/>
-    <w:p/>
-    <w:p/>
-    <w:p/>
-    <w:p/>
-    <w:p>
-      <w:pPr>
-        <w:tabs>
-          <w:tab w:val="left" w:pos="3040"/>
-        </w:tabs>
-      </w:pPr>
-      <w:r>
-        <w:tab/>
-      </w:r>
+    <w:p>
+      <w:pPr>
+        <w:tabs>
+          <w:tab w:val="left" w:pos="3040"/>
+        </w:tabs>
+      </w:pPr>
+    </w:p>
+    <w:p>
+      <w:pPr>
+        <w:tabs>
+          <w:tab w:val="left" w:pos="3040"/>
+        </w:tabs>
+      </w:pPr>
+    </w:p>
+    <w:p>
+      <w:pPr>
+        <w:tabs>
+          <w:tab w:val="left" w:pos="3040"/>
+        </w:tabs>
+      </w:pPr>
+    </w:p>
+    <w:p>
+      <w:pPr>
+        <w:tabs>
+          <w:tab w:val="left" w:pos="3040"/>
+        </w:tabs>
+      </w:pPr>
+    </w:p>
+    <w:p>
+      <w:pPr>
+        <w:tabs>
+          <w:tab w:val="left" w:pos="3040"/>
+        </w:tabs>
+      </w:pPr>
+    </w:p>
+    <w:p>
+      <w:pPr>
+        <w:tabs>
+          <w:tab w:val="left" w:pos="3040"/>
+        </w:tabs>
+      </w:pPr>
+    </w:p>
+    <w:p>
+      <w:pPr>
+        <w:tabs>
+          <w:tab w:val="left" w:pos="3040"/>
+        </w:tabs>
+      </w:pPr>
+    </w:p>
+    <w:p>
+      <w:pPr>
+        <w:tabs>
+          <w:tab w:val="left" w:pos="3040"/>
+        </w:tabs>
+      </w:pPr>
+    </w:p>
+    <w:p>
+      <w:pPr>
+        <w:tabs>
+          <w:tab w:val="left" w:pos="3040"/>
+        </w:tabs>
+      </w:pPr>
+    </w:p>
+    <w:p>
+      <w:pPr>
+        <w:tabs>
+          <w:tab w:val="left" w:pos="3040"/>
+        </w:tabs>
+      </w:pPr>
+    </w:p>
+    <w:p>
+      <w:pPr>
+        <w:tabs>
+          <w:tab w:val="left" w:pos="3040"/>
+        </w:tabs>
+      </w:pPr>
+    </w:p>
+    <w:p>
+      <w:pPr>
+        <w:tabs>
+          <w:tab w:val="left" w:pos="3040"/>
+        </w:tabs>
+      </w:pPr>
+    </w:p>
+    <w:p>
+      <w:pPr>
+        <w:tabs>
+          <w:tab w:val="left" w:pos="3040"/>
+        </w:tabs>
+      </w:pPr>
+    </w:p>
+    <w:p>
+      <w:pPr>
+        <w:tabs>
+          <w:tab w:val="left" w:pos="3040"/>
+        </w:tabs>
+      </w:pPr>
+    </w:p>
+    <w:p>
+      <w:pPr>
+        <w:tabs>
+          <w:tab w:val="left" w:pos="3040"/>
+        </w:tabs>
+      </w:pPr>
+    </w:p>
+    <w:p>
+      <w:pPr>
+        <w:tabs>
+          <w:tab w:val="left" w:pos="3040"/>
+        </w:tabs>
+      </w:pPr>
+    </w:p>
+    <w:p>
+      <w:pPr>
+        <w:tabs>
+          <w:tab w:val="left" w:pos="3040"/>
+        </w:tabs>
+      </w:pPr>
+    </w:p>
+    <w:p>
+      <w:pPr>
+        <w:tabs>
+          <w:tab w:val="left" w:pos="3040"/>
+        </w:tabs>
+      </w:pPr>
+    </w:p>
+    <w:p>
+      <w:pPr>
+        <w:tabs>
+          <w:tab w:val="left" w:pos="3040"/>
+        </w:tabs>
+      </w:pPr>
+    </w:p>
+    <w:p>
+      <w:pPr>
+        <w:tabs>
+          <w:tab w:val="left" w:pos="3040"/>
+        </w:tabs>
+      </w:pPr>
+    </w:p>
+    <w:p>
+      <w:pPr>
+        <w:tabs>
+          <w:tab w:val="left" w:pos="3040"/>
+        </w:tabs>
+      </w:pPr>
+    </w:p>
+    <w:p>
+      <w:pPr>
+        <w:tabs>
+          <w:tab w:val="left" w:pos="3040"/>
+        </w:tabs>
+      </w:pPr>
+    </w:p>
+    <w:p>
+      <w:pPr>
+        <w:tabs>
+          <w:tab w:val="left" w:pos="3040"/>
+        </w:tabs>
+      </w:pPr>
+    </w:p>
+    <w:p>
+      <w:pPr>
+        <w:tabs>
+          <w:tab w:val="left" w:pos="3040"/>
+        </w:tabs>
+      </w:pPr>
     </w:p>
     <w:sectPr>
-      <w:headerReference w:type="even" r:id="rId11"/>
-      <w:headerReference w:type="default" r:id="rId12"/>
-      <w:footerReference w:type="even" r:id="rId13"/>
-      <w:footerReference w:type="default" r:id="rId14"/>
-      <w:headerReference w:type="first" r:id="rId15"/>
-      <w:footerReference w:type="first" r:id="rId16"/>
+      <w:headerReference w:type="even" r:id="rId20"/>
+      <w:headerReference w:type="default" r:id="rId21"/>
+      <w:footerReference w:type="even" r:id="rId22"/>
+      <w:footerReference w:type="default" r:id="rId23"/>
+      <w:headerReference w:type="first" r:id="rId24"/>
+      <w:footerReference w:type="first" r:id="rId25"/>
       <w:pgSz w:w="11906" w:h="16838"/>
       <w:pgMar w:top="1440" w:right="1440" w:bottom="1440" w:left="1440" w:header="708" w:footer="708" w:gutter="0"/>
       <w:cols w:space="708"/>

</xml_diff>